<commit_message>
Project Guide Updated w/ Video Example
</commit_message>
<xml_diff>
--- a/Project Guide/22 STEP PRACTICE PROJECT 1.docx
+++ b/Project Guide/22 STEP PRACTICE PROJECT 1.docx
@@ -67,6 +67,19 @@
     </w:p>
     <w:p>
       <w:r>
+        <w:t xml:space="preserve">View the video to see a pull request and merge - </w:t>
+      </w:r>
+      <w:hyperlink r:id="rId5" w:history="1">
+        <w:r>
+          <w:rPr>
+            <w:rStyle w:val="Hyperlink"/>
+          </w:rPr>
+          <w:t>https://youtu.be/Tja18QyEgeI</w:t>
+        </w:r>
+      </w:hyperlink>
+    </w:p>
+    <w:p>
+      <w:r>
         <w:t>------------------------------------------------------------------------------------------------------------------</w:t>
       </w:r>
     </w:p>
@@ -349,6 +362,7 @@
     <w:p/>
     <w:p>
       <w:r>
+        <w:lastRenderedPageBreak/>
         <w:t>------------------------------------------------------------------------------------------------------------------</w:t>
       </w:r>
     </w:p>
@@ -358,7 +372,6 @@
           <w:b/>
           <w:bCs/>
         </w:rPr>
-        <w:lastRenderedPageBreak/>
         <w:t>Step 2 — Andrew Kirk — create the starter files and commit the foundation</w:t>
       </w:r>
     </w:p>
@@ -633,12 +646,12 @@
           <w:b/>
           <w:bCs/>
         </w:rPr>
+        <w:lastRenderedPageBreak/>
         <w:t>Paste this into main.py:</w:t>
       </w:r>
     </w:p>
     <w:p>
       <w:r>
-        <w:lastRenderedPageBreak/>
         <w:t>"""Main menu starter. Primary developer: Andrew Kirk (Student A)."""</w:t>
       </w:r>
     </w:p>
@@ -762,7 +775,6 @@
     <w:p/>
     <w:p>
       <w:r>
-        <w:lastRenderedPageBreak/>
         <w:t xml:space="preserve">def </w:t>
       </w:r>
       <w:proofErr w:type="spellStart"/>
@@ -918,6 +930,7 @@
           <w:b/>
           <w:bCs/>
         </w:rPr>
+        <w:lastRenderedPageBreak/>
         <w:t>Paste this into the root .</w:t>
       </w:r>
       <w:proofErr w:type="spellStart"/>
@@ -939,7 +952,6 @@
     </w:p>
     <w:p>
       <w:r>
-        <w:lastRenderedPageBreak/>
         <w:t>__</w:t>
       </w:r>
       <w:proofErr w:type="spellStart"/>
@@ -1157,12 +1169,12 @@
     </w:p>
     <w:p>
       <w:r>
+        <w:lastRenderedPageBreak/>
         <w:t>1. Add Sleep Entry</w:t>
       </w:r>
     </w:p>
     <w:p>
       <w:r>
-        <w:lastRenderedPageBreak/>
         <w:t>2. View Summary</w:t>
       </w:r>
     </w:p>
@@ -1529,6 +1541,7 @@
         </w:numPr>
       </w:pPr>
       <w:r>
+        <w:lastRenderedPageBreak/>
         <w:t xml:space="preserve">Confirm the branch is </w:t>
       </w:r>
       <w:r>
@@ -1550,7 +1563,6 @@
         </w:numPr>
       </w:pPr>
       <w:r>
-        <w:lastRenderedPageBreak/>
         <w:t xml:space="preserve">Open sleep_log_tracker/main.py and select </w:t>
       </w:r>
       <w:r>
@@ -1890,6 +1902,7 @@
     </w:p>
     <w:p>
       <w:r>
+        <w:lastRenderedPageBreak/>
         <w:t xml:space="preserve">Use Andrew’s </w:t>
       </w:r>
       <w:r>
@@ -1923,7 +1936,6 @@
         </w:numPr>
       </w:pPr>
       <w:r>
-        <w:lastRenderedPageBreak/>
         <w:t xml:space="preserve">Confirm </w:t>
       </w:r>
       <w:r>
@@ -2224,6 +2236,7 @@
     <w:p/>
     <w:p>
       <w:r>
+        <w:lastRenderedPageBreak/>
         <w:t xml:space="preserve">        choice = input("Choose an option: ")</w:t>
       </w:r>
     </w:p>
@@ -2593,6 +2606,7 @@
     </w:p>
     <w:p>
       <w:r>
+        <w:lastRenderedPageBreak/>
         <w:t>Implement repeating menu and option routing</w:t>
       </w:r>
     </w:p>
@@ -2604,7 +2618,6 @@
         </w:numPr>
       </w:pPr>
       <w:r>
-        <w:lastRenderedPageBreak/>
         <w:t xml:space="preserve">Click </w:t>
       </w:r>
       <w:r>
@@ -2880,6 +2893,7 @@
     </w:p>
     <w:p>
       <w:r>
+        <w:lastRenderedPageBreak/>
         <w:t xml:space="preserve">        print("4. Exit")</w:t>
       </w:r>
     </w:p>
@@ -3200,6 +3214,7 @@
           </w:tcPr>
           <w:p>
             <w:r>
+              <w:lastRenderedPageBreak/>
               <w:t>word</w:t>
             </w:r>
           </w:p>
@@ -3229,7 +3244,6 @@
           </w:tcPr>
           <w:p>
             <w:r>
-              <w:lastRenderedPageBreak/>
               <w:t>1 with surrounding spaces</w:t>
             </w:r>
           </w:p>
@@ -3565,190 +3579,189 @@
     <w:p/>
     <w:p>
       <w:r>
+        <w:t>def main():</w:t>
+      </w:r>
+    </w:p>
+    <w:p>
+      <w:r>
+        <w:t xml:space="preserve">    """Repeat the menu and call the selected tracking function."""</w:t>
+      </w:r>
+    </w:p>
+    <w:p>
+      <w:r>
+        <w:t xml:space="preserve">    print("Welcome to Sleep Log Tracker!")</w:t>
+      </w:r>
+    </w:p>
+    <w:p/>
+    <w:p>
+      <w:r>
+        <w:t xml:space="preserve">    while True:</w:t>
+      </w:r>
+    </w:p>
+    <w:p>
+      <w:r>
+        <w:t xml:space="preserve">        print("\n1. Add Sleep Entry")</w:t>
+      </w:r>
+    </w:p>
+    <w:p>
+      <w:r>
+        <w:t xml:space="preserve">        print("2. View Summary")</w:t>
+      </w:r>
+    </w:p>
+    <w:p>
+      <w:r>
+        <w:t xml:space="preserve">        print("3. View All Entries")</w:t>
+      </w:r>
+    </w:p>
+    <w:p>
+      <w:r>
+        <w:t xml:space="preserve">        print("4. Exit")</w:t>
+      </w:r>
+    </w:p>
+    <w:p/>
+    <w:p>
+      <w:r>
+        <w:t xml:space="preserve">        try:</w:t>
+      </w:r>
+    </w:p>
+    <w:p>
+      <w:r>
+        <w:t xml:space="preserve">            choice = input("Choose an option: ").strip()</w:t>
+      </w:r>
+    </w:p>
+    <w:p>
+      <w:r>
+        <w:t xml:space="preserve">        except </w:t>
+      </w:r>
+      <w:proofErr w:type="spellStart"/>
+      <w:r>
+        <w:t>EOFError</w:t>
+      </w:r>
+      <w:proofErr w:type="spellEnd"/>
+      <w:r>
+        <w:t>:</w:t>
+      </w:r>
+    </w:p>
+    <w:p>
+      <w:r>
+        <w:t xml:space="preserve">            print("\</w:t>
+      </w:r>
+      <w:proofErr w:type="spellStart"/>
+      <w:r>
+        <w:t>nGoodbye</w:t>
+      </w:r>
+      <w:proofErr w:type="spellEnd"/>
+      <w:r>
+        <w:t>!")</w:t>
+      </w:r>
+    </w:p>
+    <w:p>
+      <w:r>
+        <w:t xml:space="preserve">            break</w:t>
+      </w:r>
+    </w:p>
+    <w:p/>
+    <w:p>
+      <w:r>
+        <w:t xml:space="preserve">        if choice == "1":</w:t>
+      </w:r>
+    </w:p>
+    <w:p>
+      <w:r>
+        <w:t xml:space="preserve">            </w:t>
+      </w:r>
+      <w:proofErr w:type="spellStart"/>
+      <w:r>
+        <w:t>add_entry</w:t>
+      </w:r>
+      <w:proofErr w:type="spellEnd"/>
+      <w:r>
+        <w:t>()</w:t>
+      </w:r>
+    </w:p>
+    <w:p>
+      <w:r>
+        <w:t xml:space="preserve">        </w:t>
+      </w:r>
+      <w:proofErr w:type="spellStart"/>
+      <w:r>
+        <w:t>elif</w:t>
+      </w:r>
+      <w:proofErr w:type="spellEnd"/>
+      <w:r>
+        <w:t xml:space="preserve"> choice == "2":</w:t>
+      </w:r>
+    </w:p>
+    <w:p>
+      <w:r>
+        <w:t xml:space="preserve">            </w:t>
+      </w:r>
+      <w:proofErr w:type="spellStart"/>
+      <w:r>
+        <w:t>view_summary</w:t>
+      </w:r>
+      <w:proofErr w:type="spellEnd"/>
+      <w:r>
+        <w:t>()</w:t>
+      </w:r>
+    </w:p>
+    <w:p>
+      <w:r>
+        <w:t xml:space="preserve">        </w:t>
+      </w:r>
+      <w:proofErr w:type="spellStart"/>
+      <w:r>
+        <w:t>elif</w:t>
+      </w:r>
+      <w:proofErr w:type="spellEnd"/>
+      <w:r>
+        <w:t xml:space="preserve"> choice == "3":</w:t>
+      </w:r>
+    </w:p>
+    <w:p>
+      <w:r>
+        <w:t xml:space="preserve">            </w:t>
+      </w:r>
+      <w:proofErr w:type="spellStart"/>
+      <w:r>
+        <w:t>view_all</w:t>
+      </w:r>
+      <w:proofErr w:type="spellEnd"/>
+      <w:r>
+        <w:t>()</w:t>
+      </w:r>
+    </w:p>
+    <w:p>
+      <w:r>
+        <w:t xml:space="preserve">        </w:t>
+      </w:r>
+      <w:proofErr w:type="spellStart"/>
+      <w:r>
+        <w:t>elif</w:t>
+      </w:r>
+      <w:proofErr w:type="spellEnd"/>
+      <w:r>
+        <w:t xml:space="preserve"> choice == "4":</w:t>
+      </w:r>
+    </w:p>
+    <w:p>
+      <w:r>
+        <w:t xml:space="preserve">            print("Goodbye!")</w:t>
+      </w:r>
+    </w:p>
+    <w:p>
+      <w:r>
+        <w:t xml:space="preserve">            break</w:t>
+      </w:r>
+    </w:p>
+    <w:p>
+      <w:r>
         <w:lastRenderedPageBreak/>
-        <w:t>def main():</w:t>
-      </w:r>
-    </w:p>
-    <w:p>
-      <w:r>
-        <w:t xml:space="preserve">    """Repeat the menu and call the selected tracking function."""</w:t>
-      </w:r>
-    </w:p>
-    <w:p>
-      <w:r>
-        <w:t xml:space="preserve">    print("Welcome to Sleep Log Tracker!")</w:t>
-      </w:r>
-    </w:p>
-    <w:p/>
-    <w:p>
-      <w:r>
-        <w:t xml:space="preserve">    while True:</w:t>
-      </w:r>
-    </w:p>
-    <w:p>
-      <w:r>
-        <w:t xml:space="preserve">        print("\n1. Add Sleep Entry")</w:t>
-      </w:r>
-    </w:p>
-    <w:p>
-      <w:r>
-        <w:t xml:space="preserve">        print("2. View Summary")</w:t>
-      </w:r>
-    </w:p>
-    <w:p>
-      <w:r>
-        <w:t xml:space="preserve">        print("3. View All Entries")</w:t>
-      </w:r>
-    </w:p>
-    <w:p>
-      <w:r>
-        <w:t xml:space="preserve">        print("4. Exit")</w:t>
-      </w:r>
-    </w:p>
-    <w:p/>
-    <w:p>
-      <w:r>
-        <w:t xml:space="preserve">        try:</w:t>
-      </w:r>
-    </w:p>
-    <w:p>
-      <w:r>
-        <w:t xml:space="preserve">            choice = input("Choose an option: ").strip()</w:t>
-      </w:r>
-    </w:p>
-    <w:p>
-      <w:r>
-        <w:t xml:space="preserve">        except </w:t>
-      </w:r>
-      <w:proofErr w:type="spellStart"/>
-      <w:r>
-        <w:t>EOFError</w:t>
-      </w:r>
-      <w:proofErr w:type="spellEnd"/>
-      <w:r>
-        <w:t>:</w:t>
-      </w:r>
-    </w:p>
-    <w:p>
-      <w:r>
-        <w:t xml:space="preserve">            print("\</w:t>
-      </w:r>
-      <w:proofErr w:type="spellStart"/>
-      <w:r>
-        <w:t>nGoodbye</w:t>
-      </w:r>
-      <w:proofErr w:type="spellEnd"/>
-      <w:r>
-        <w:t>!")</w:t>
-      </w:r>
-    </w:p>
-    <w:p>
-      <w:r>
-        <w:t xml:space="preserve">            break</w:t>
-      </w:r>
-    </w:p>
-    <w:p/>
-    <w:p>
-      <w:r>
-        <w:t xml:space="preserve">        if choice == "1":</w:t>
-      </w:r>
-    </w:p>
-    <w:p>
-      <w:r>
-        <w:t xml:space="preserve">            </w:t>
-      </w:r>
-      <w:proofErr w:type="spellStart"/>
-      <w:r>
-        <w:t>add_entry</w:t>
-      </w:r>
-      <w:proofErr w:type="spellEnd"/>
-      <w:r>
-        <w:t>()</w:t>
-      </w:r>
-    </w:p>
-    <w:p>
-      <w:r>
-        <w:t xml:space="preserve">        </w:t>
-      </w:r>
-      <w:proofErr w:type="spellStart"/>
-      <w:r>
-        <w:t>elif</w:t>
-      </w:r>
-      <w:proofErr w:type="spellEnd"/>
-      <w:r>
-        <w:t xml:space="preserve"> choice == "2":</w:t>
-      </w:r>
-    </w:p>
-    <w:p>
-      <w:r>
-        <w:t xml:space="preserve">            </w:t>
-      </w:r>
-      <w:proofErr w:type="spellStart"/>
-      <w:r>
-        <w:t>view_summary</w:t>
-      </w:r>
-      <w:proofErr w:type="spellEnd"/>
-      <w:r>
-        <w:t>()</w:t>
-      </w:r>
-    </w:p>
-    <w:p>
-      <w:r>
-        <w:t xml:space="preserve">        </w:t>
-      </w:r>
-      <w:proofErr w:type="spellStart"/>
-      <w:r>
-        <w:t>elif</w:t>
-      </w:r>
-      <w:proofErr w:type="spellEnd"/>
-      <w:r>
-        <w:t xml:space="preserve"> choice == "3":</w:t>
-      </w:r>
-    </w:p>
-    <w:p>
-      <w:r>
-        <w:t xml:space="preserve">            </w:t>
-      </w:r>
-      <w:proofErr w:type="spellStart"/>
-      <w:r>
-        <w:t>view_all</w:t>
-      </w:r>
-      <w:proofErr w:type="spellEnd"/>
-      <w:r>
-        <w:t>()</w:t>
-      </w:r>
-    </w:p>
-    <w:p>
-      <w:r>
-        <w:t xml:space="preserve">        </w:t>
-      </w:r>
-      <w:proofErr w:type="spellStart"/>
-      <w:r>
-        <w:t>elif</w:t>
-      </w:r>
-      <w:proofErr w:type="spellEnd"/>
-      <w:r>
-        <w:t xml:space="preserve"> choice == "4":</w:t>
-      </w:r>
-    </w:p>
-    <w:p>
-      <w:r>
-        <w:t xml:space="preserve">            print("Goodbye!")</w:t>
-      </w:r>
-    </w:p>
-    <w:p>
-      <w:r>
-        <w:t xml:space="preserve">            break</w:t>
-      </w:r>
-    </w:p>
-    <w:p>
-      <w:r>
         <w:t xml:space="preserve">        else:</w:t>
       </w:r>
     </w:p>
     <w:p>
       <w:r>
-        <w:lastRenderedPageBreak/>
         <w:t xml:space="preserve">            print("Invalid choice. Please enter 1, 2, 3, or 4.")</w:t>
       </w:r>
     </w:p>
@@ -3994,190 +4007,190 @@
     </w:p>
     <w:p>
       <w:r>
+        <w:lastRenderedPageBreak/>
         <w:t xml:space="preserve">    print("Enter dates as YYYY-MM-DD, hours from 0 to 24, and quality from 1 to 5 (5 is best).")</w:t>
       </w:r>
     </w:p>
     <w:p>
       <w:r>
+        <w:t xml:space="preserve">    print("Notes are optional. Decimal hours are allowed.")</w:t>
+      </w:r>
+    </w:p>
+    <w:p>
+      <w:r>
+        <w:t xml:space="preserve">    print("Choose 1 to add, 2 for a summary, 3 for all entries, or 4 to exit.")</w:t>
+      </w:r>
+    </w:p>
+    <w:p>
+      <w:r>
+        <w:t xml:space="preserve">    print("The summary shows entry count, total and average hours, and best and worst quality.")</w:t>
+      </w:r>
+    </w:p>
+    <w:p>
+      <w:r>
+        <w:t xml:space="preserve">    print("Entries are stored only for this run and are cleared when the program closes.")</w:t>
+      </w:r>
+    </w:p>
+    <w:p/>
+    <w:p>
+      <w:r>
+        <w:t xml:space="preserve">    while True:</w:t>
+      </w:r>
+    </w:p>
+    <w:p>
+      <w:r>
+        <w:t xml:space="preserve">        print("\n1. Add Sleep Entry")</w:t>
+      </w:r>
+    </w:p>
+    <w:p>
+      <w:r>
+        <w:t xml:space="preserve">        print("2. View Summary")</w:t>
+      </w:r>
+    </w:p>
+    <w:p>
+      <w:r>
+        <w:t xml:space="preserve">        print("3. View All Entries")</w:t>
+      </w:r>
+    </w:p>
+    <w:p>
+      <w:r>
+        <w:t xml:space="preserve">        print("4. Exit")</w:t>
+      </w:r>
+    </w:p>
+    <w:p/>
+    <w:p>
+      <w:r>
+        <w:t xml:space="preserve">        try:</w:t>
+      </w:r>
+    </w:p>
+    <w:p>
+      <w:r>
+        <w:t xml:space="preserve">            choice = input("Choose an option: ").strip()</w:t>
+      </w:r>
+    </w:p>
+    <w:p>
+      <w:r>
+        <w:t xml:space="preserve">        except </w:t>
+      </w:r>
+      <w:proofErr w:type="spellStart"/>
+      <w:r>
+        <w:t>EOFError</w:t>
+      </w:r>
+      <w:proofErr w:type="spellEnd"/>
+      <w:r>
+        <w:t>:</w:t>
+      </w:r>
+    </w:p>
+    <w:p>
+      <w:r>
+        <w:t xml:space="preserve">            print("\</w:t>
+      </w:r>
+      <w:proofErr w:type="spellStart"/>
+      <w:r>
+        <w:t>nGoodbye</w:t>
+      </w:r>
+      <w:proofErr w:type="spellEnd"/>
+      <w:r>
+        <w:t>!")</w:t>
+      </w:r>
+    </w:p>
+    <w:p>
+      <w:r>
+        <w:t xml:space="preserve">            break</w:t>
+      </w:r>
+    </w:p>
+    <w:p/>
+    <w:p>
+      <w:r>
+        <w:t xml:space="preserve">        if choice == "1":</w:t>
+      </w:r>
+    </w:p>
+    <w:p>
+      <w:r>
+        <w:t xml:space="preserve">            </w:t>
+      </w:r>
+      <w:proofErr w:type="spellStart"/>
+      <w:r>
+        <w:t>add_entry</w:t>
+      </w:r>
+      <w:proofErr w:type="spellEnd"/>
+      <w:r>
+        <w:t>()</w:t>
+      </w:r>
+    </w:p>
+    <w:p>
+      <w:r>
+        <w:t xml:space="preserve">        </w:t>
+      </w:r>
+      <w:proofErr w:type="spellStart"/>
+      <w:r>
+        <w:t>elif</w:t>
+      </w:r>
+      <w:proofErr w:type="spellEnd"/>
+      <w:r>
+        <w:t xml:space="preserve"> choice == "2":</w:t>
+      </w:r>
+    </w:p>
+    <w:p>
+      <w:r>
+        <w:t xml:space="preserve">            </w:t>
+      </w:r>
+      <w:proofErr w:type="spellStart"/>
+      <w:r>
+        <w:t>view_summary</w:t>
+      </w:r>
+      <w:proofErr w:type="spellEnd"/>
+      <w:r>
+        <w:t>()</w:t>
+      </w:r>
+    </w:p>
+    <w:p>
+      <w:r>
+        <w:t xml:space="preserve">        </w:t>
+      </w:r>
+      <w:proofErr w:type="spellStart"/>
+      <w:r>
+        <w:t>elif</w:t>
+      </w:r>
+      <w:proofErr w:type="spellEnd"/>
+      <w:r>
+        <w:t xml:space="preserve"> choice == "3":</w:t>
+      </w:r>
+    </w:p>
+    <w:p>
+      <w:r>
+        <w:t xml:space="preserve">            </w:t>
+      </w:r>
+      <w:proofErr w:type="spellStart"/>
+      <w:r>
+        <w:t>view_all</w:t>
+      </w:r>
+      <w:proofErr w:type="spellEnd"/>
+      <w:r>
+        <w:t>()</w:t>
+      </w:r>
+    </w:p>
+    <w:p>
+      <w:r>
+        <w:t xml:space="preserve">        </w:t>
+      </w:r>
+      <w:proofErr w:type="spellStart"/>
+      <w:r>
+        <w:t>elif</w:t>
+      </w:r>
+      <w:proofErr w:type="spellEnd"/>
+      <w:r>
+        <w:t xml:space="preserve"> choice == "4":</w:t>
+      </w:r>
+    </w:p>
+    <w:p>
+      <w:r>
         <w:lastRenderedPageBreak/>
-        <w:t xml:space="preserve">    print("Notes are optional. Decimal hours are allowed.")</w:t>
-      </w:r>
-    </w:p>
-    <w:p>
-      <w:r>
-        <w:t xml:space="preserve">    print("Choose 1 to add, 2 for a summary, 3 for all entries, or 4 to exit.")</w:t>
-      </w:r>
-    </w:p>
-    <w:p>
-      <w:r>
-        <w:t xml:space="preserve">    print("The summary shows entry count, total and average hours, and best and worst quality.")</w:t>
-      </w:r>
-    </w:p>
-    <w:p>
-      <w:r>
-        <w:t xml:space="preserve">    print("Entries are stored only for this run and are cleared when the program closes.")</w:t>
-      </w:r>
-    </w:p>
-    <w:p/>
-    <w:p>
-      <w:r>
-        <w:t xml:space="preserve">    while True:</w:t>
-      </w:r>
-    </w:p>
-    <w:p>
-      <w:r>
-        <w:t xml:space="preserve">        print("\n1. Add Sleep Entry")</w:t>
-      </w:r>
-    </w:p>
-    <w:p>
-      <w:r>
-        <w:t xml:space="preserve">        print("2. View Summary")</w:t>
-      </w:r>
-    </w:p>
-    <w:p>
-      <w:r>
-        <w:t xml:space="preserve">        print("3. View All Entries")</w:t>
-      </w:r>
-    </w:p>
-    <w:p>
-      <w:r>
-        <w:t xml:space="preserve">        print("4. Exit")</w:t>
-      </w:r>
-    </w:p>
-    <w:p/>
-    <w:p>
-      <w:r>
-        <w:t xml:space="preserve">        try:</w:t>
-      </w:r>
-    </w:p>
-    <w:p>
-      <w:r>
-        <w:t xml:space="preserve">            choice = input("Choose an option: ").strip()</w:t>
-      </w:r>
-    </w:p>
-    <w:p>
-      <w:r>
-        <w:t xml:space="preserve">        except </w:t>
-      </w:r>
-      <w:proofErr w:type="spellStart"/>
-      <w:r>
-        <w:t>EOFError</w:t>
-      </w:r>
-      <w:proofErr w:type="spellEnd"/>
-      <w:r>
-        <w:t>:</w:t>
-      </w:r>
-    </w:p>
-    <w:p>
-      <w:r>
-        <w:t xml:space="preserve">            print("\</w:t>
-      </w:r>
-      <w:proofErr w:type="spellStart"/>
-      <w:r>
-        <w:t>nGoodbye</w:t>
-      </w:r>
-      <w:proofErr w:type="spellEnd"/>
-      <w:r>
-        <w:t>!")</w:t>
-      </w:r>
-    </w:p>
-    <w:p>
-      <w:r>
-        <w:t xml:space="preserve">            break</w:t>
-      </w:r>
-    </w:p>
-    <w:p/>
-    <w:p>
-      <w:r>
-        <w:t xml:space="preserve">        if choice == "1":</w:t>
-      </w:r>
-    </w:p>
-    <w:p>
-      <w:r>
-        <w:t xml:space="preserve">            </w:t>
-      </w:r>
-      <w:proofErr w:type="spellStart"/>
-      <w:r>
-        <w:t>add_entry</w:t>
-      </w:r>
-      <w:proofErr w:type="spellEnd"/>
-      <w:r>
-        <w:t>()</w:t>
-      </w:r>
-    </w:p>
-    <w:p>
-      <w:r>
-        <w:t xml:space="preserve">        </w:t>
-      </w:r>
-      <w:proofErr w:type="spellStart"/>
-      <w:r>
-        <w:t>elif</w:t>
-      </w:r>
-      <w:proofErr w:type="spellEnd"/>
-      <w:r>
-        <w:t xml:space="preserve"> choice == "2":</w:t>
-      </w:r>
-    </w:p>
-    <w:p>
-      <w:r>
-        <w:t xml:space="preserve">            </w:t>
-      </w:r>
-      <w:proofErr w:type="spellStart"/>
-      <w:r>
-        <w:t>view_summary</w:t>
-      </w:r>
-      <w:proofErr w:type="spellEnd"/>
-      <w:r>
-        <w:t>()</w:t>
-      </w:r>
-    </w:p>
-    <w:p>
-      <w:r>
-        <w:t xml:space="preserve">        </w:t>
-      </w:r>
-      <w:proofErr w:type="spellStart"/>
-      <w:r>
-        <w:t>elif</w:t>
-      </w:r>
-      <w:proofErr w:type="spellEnd"/>
-      <w:r>
-        <w:t xml:space="preserve"> choice == "3":</w:t>
-      </w:r>
-    </w:p>
-    <w:p>
-      <w:r>
-        <w:t xml:space="preserve">            </w:t>
-      </w:r>
-      <w:proofErr w:type="spellStart"/>
-      <w:r>
-        <w:t>view_all</w:t>
-      </w:r>
-      <w:proofErr w:type="spellEnd"/>
-      <w:r>
-        <w:t>()</w:t>
-      </w:r>
-    </w:p>
-    <w:p>
-      <w:r>
-        <w:t xml:space="preserve">        </w:t>
-      </w:r>
-      <w:proofErr w:type="spellStart"/>
-      <w:r>
-        <w:t>elif</w:t>
-      </w:r>
-      <w:proofErr w:type="spellEnd"/>
-      <w:r>
-        <w:t xml:space="preserve"> choice == "4":</w:t>
-      </w:r>
-    </w:p>
-    <w:p>
-      <w:r>
         <w:t xml:space="preserve">            print("Goodbye!")</w:t>
       </w:r>
     </w:p>
     <w:p>
       <w:r>
-        <w:lastRenderedPageBreak/>
         <w:t xml:space="preserve">            break</w:t>
       </w:r>
     </w:p>
@@ -4466,12 +4479,12 @@
           <w:b/>
           <w:bCs/>
         </w:rPr>
+        <w:lastRenderedPageBreak/>
         <w:t>Type this prompt:</w:t>
       </w:r>
     </w:p>
     <w:p>
       <w:r>
-        <w:lastRenderedPageBreak/>
         <w:t xml:space="preserve">Review sleep_log_tracker/main.py for matching function routing, blank and invalid choices, surrounding spaces, option 4, </w:t>
       </w:r>
       <w:proofErr w:type="spellStart"/>
@@ -4594,7 +4607,6 @@
     <w:p/>
     <w:p>
       <w:r>
-        <w:lastRenderedPageBreak/>
         <w:t>## Responsibilities</w:t>
       </w:r>
     </w:p>
@@ -4781,6 +4793,7 @@
         </w:numPr>
       </w:pPr>
       <w:r>
+        <w:lastRenderedPageBreak/>
         <w:t xml:space="preserve">Save both files and stage </w:t>
       </w:r>
       <w:r>
@@ -4810,7 +4823,6 @@
           <w:b/>
           <w:bCs/>
         </w:rPr>
-        <w:lastRenderedPageBreak/>
         <w:t>Use this commit message:</w:t>
       </w:r>
     </w:p>
@@ -5002,6 +5014,7 @@
         </w:numPr>
       </w:pPr>
       <w:r>
+        <w:lastRenderedPageBreak/>
         <w:t xml:space="preserve">In </w:t>
       </w:r>
       <w:r>
@@ -5017,7 +5030,6 @@
     </w:p>
     <w:p>
       <w:r>
-        <w:lastRenderedPageBreak/>
         <w:t>qingyunli1</w:t>
       </w:r>
     </w:p>
@@ -35604,6 +35616,7 @@
   <w:style w:type="character" w:default="1" w:styleId="DefaultParagraphFont">
     <w:name w:val="Default Paragraph Font"/>
     <w:uiPriority w:val="1"/>
+    <w:semiHidden/>
     <w:unhideWhenUsed/>
   </w:style>
   <w:style w:type="table" w:default="1" w:styleId="TableNormal">
@@ -35915,6 +35928,29 @@
       <w:smallCaps/>
       <w:color w:val="0F4761" w:themeColor="accent1" w:themeShade="BF"/>
       <w:spacing w:val="5"/>
+    </w:rPr>
+  </w:style>
+  <w:style w:type="character" w:styleId="Hyperlink">
+    <w:name w:val="Hyperlink"/>
+    <w:basedOn w:val="DefaultParagraphFont"/>
+    <w:uiPriority w:val="99"/>
+    <w:unhideWhenUsed/>
+    <w:rsid w:val="00296027"/>
+    <w:rPr>
+      <w:color w:val="467886" w:themeColor="hyperlink"/>
+      <w:u w:val="single"/>
+    </w:rPr>
+  </w:style>
+  <w:style w:type="character" w:styleId="UnresolvedMention">
+    <w:name w:val="Unresolved Mention"/>
+    <w:basedOn w:val="DefaultParagraphFont"/>
+    <w:uiPriority w:val="99"/>
+    <w:semiHidden/>
+    <w:unhideWhenUsed/>
+    <w:rsid w:val="00296027"/>
+    <w:rPr>
+      <w:color w:val="605E5C"/>
+      <w:shd w:val="clear" w:color="auto" w:fill="E1DFDD"/>
     </w:rPr>
   </w:style>
 </w:styles>

</xml_diff>